<commit_message>
Deploying to gh-pages from @ waynetheisinger/portfolio@d5c742dca49b8621e80bd419f3c2c18c255dfa38 🚀
</commit_message>
<xml_diff>
--- a/assets/Wayne-Theisinger-CV.docx
+++ b/assets/Wayne-Theisinger-CV.docx
@@ -44,10 +44,9 @@
           <w:footerReference w:type="even" r:id="rId2"/>
           <w:footerReference w:type="default" r:id="rId3"/>
           <w:footerReference w:type="first" r:id="rId4"/>
-          <w:type w:val="nextPage"/>
+          <w:type w:val="continuous"/>
           <w:pgSz w:w="11906" w:h="16838"/>
           <w:pgMar w:left="1134" w:right="1134" w:gutter="0" w:header="0" w:top="1134" w:footer="850" w:bottom="2050"/>
-          <w:pgNumType w:fmt="decimal"/>
           <w:cols w:num="2" w:equalWidth="false" w:sep="true">
             <w:col w:w="3968" w:space="170"/>
             <w:col w:w="5499"/>
@@ -218,85 +217,16 @@
         </w:rPr>
         <w:t>I have over 20 years experience in technology and business, specialising in building solutions for e</w:t>
         <w:noBreakHyphen/>
-        <w:t xml:space="preserve">commerce </w:t>
-      </w:r>
-      <w:r>
-        <w:rPr>
-          <w:lang w:val="en-GB"/>
-        </w:rPr>
-        <w:t>customers. I build</w:t>
-      </w:r>
-      <w:r>
-        <w:rPr>
-          <w:lang w:val="en-GB"/>
-        </w:rPr>
-        <w:t xml:space="preserve"> with </w:t>
-      </w:r>
-      <w:r>
-        <w:rPr>
-          <w:lang w:val="en-GB"/>
-        </w:rPr>
-        <w:t>an</w:t>
-      </w:r>
-      <w:r>
-        <w:rPr>
-          <w:lang w:val="en-GB"/>
-        </w:rPr>
-        <w:t xml:space="preserve"> emphasis on PHP, Laravel, Node and Vue.js </w:t>
-      </w:r>
-      <w:r>
-        <w:rPr>
-          <w:lang w:val="en-GB"/>
-        </w:rPr>
-        <w:t>or Reactjs</w:t>
-      </w:r>
-      <w:r>
-        <w:rPr>
-          <w:lang w:val="en-GB"/>
-        </w:rPr>
-        <w:t xml:space="preserve">. </w:t>
+        <w:t xml:space="preserve">commerce customers. I build with an emphasis on PHP, Laravel, Node and Vue.js or Reactjs. </w:t>
         <w:br/>
-        <w:t xml:space="preserve">I engineer scalable, </w:t>
-      </w:r>
-      <w:r>
-        <w:rPr>
-          <w:lang w:val="en-GB"/>
-        </w:rPr>
-        <w:t>fast,</w:t>
-      </w:r>
-      <w:r>
-        <w:rPr>
-          <w:lang w:val="en-GB"/>
-        </w:rPr>
-        <w:t xml:space="preserve"> secure systems with stability supported by a robust monitoring stack. </w:t>
+        <w:t xml:space="preserve">I engineer scalable, fast, secure systems with stability supported by a robust monitoring stack. </w:t>
         <w:br/>
         <w:br/>
-      </w:r>
-      <w:r>
-        <w:rPr>
-          <w:lang w:val="en-GB"/>
-        </w:rPr>
         <w:t xml:space="preserve">Recently </w:t>
       </w:r>
       <w:r>
         <w:rPr/>
-        <w:t xml:space="preserve">I </w:t>
-      </w:r>
-      <w:r>
-        <w:rPr/>
-        <w:t xml:space="preserve">have been </w:t>
-      </w:r>
-      <w:r>
-        <w:rPr/>
-        <w:t>focus</w:t>
-      </w:r>
-      <w:r>
-        <w:rPr/>
-        <w:t>ing</w:t>
-      </w:r>
-      <w:r>
-        <w:rPr/>
-        <w:t xml:space="preserve"> on </w:t>
+        <w:t xml:space="preserve">I have been focusing on </w:t>
       </w:r>
       <w:r>
         <w:rPr>
@@ -333,7 +263,7 @@
           <w:numId w:val="3"/>
         </w:numPr>
         <w:suppressAutoHyphens w:val="true"/>
-        <w:overflowPunct w:val="true"/>
+        <w:overflowPunct w:val="false"/>
         <w:bidi w:val="0"/>
         <w:spacing w:lineRule="auto" w:line="276" w:before="0" w:after="119"/>
         <w:ind w:hanging="283" w:start="567" w:end="227"/>
@@ -355,7 +285,7 @@
           <w:numId w:val="3"/>
         </w:numPr>
         <w:suppressAutoHyphens w:val="true"/>
-        <w:overflowPunct w:val="true"/>
+        <w:overflowPunct w:val="false"/>
         <w:bidi w:val="0"/>
         <w:spacing w:lineRule="auto" w:line="276" w:before="0" w:after="119"/>
         <w:ind w:hanging="283" w:start="567" w:end="227"/>
@@ -377,7 +307,7 @@
           <w:numId w:val="3"/>
         </w:numPr>
         <w:suppressAutoHyphens w:val="true"/>
-        <w:overflowPunct w:val="true"/>
+        <w:overflowPunct w:val="false"/>
         <w:bidi w:val="0"/>
         <w:spacing w:lineRule="auto" w:line="276" w:before="0" w:after="119"/>
         <w:ind w:hanging="283" w:start="567" w:end="227"/>
@@ -399,7 +329,7 @@
           <w:numId w:val="3"/>
         </w:numPr>
         <w:suppressAutoHyphens w:val="true"/>
-        <w:overflowPunct w:val="true"/>
+        <w:overflowPunct w:val="false"/>
         <w:bidi w:val="0"/>
         <w:spacing w:lineRule="auto" w:line="276" w:before="0" w:after="119"/>
         <w:ind w:hanging="283" w:start="567" w:end="227"/>
@@ -421,7 +351,7 @@
           <w:numId w:val="3"/>
         </w:numPr>
         <w:suppressAutoHyphens w:val="true"/>
-        <w:overflowPunct w:val="true"/>
+        <w:overflowPunct w:val="false"/>
         <w:bidi w:val="0"/>
         <w:spacing w:lineRule="auto" w:line="276" w:before="0" w:after="119"/>
         <w:ind w:hanging="283" w:start="567" w:end="227"/>
@@ -443,7 +373,7 @@
           <w:numId w:val="3"/>
         </w:numPr>
         <w:suppressAutoHyphens w:val="true"/>
-        <w:overflowPunct w:val="true"/>
+        <w:overflowPunct w:val="false"/>
         <w:bidi w:val="0"/>
         <w:spacing w:lineRule="auto" w:line="276" w:before="0" w:after="119"/>
         <w:ind w:hanging="283" w:start="567" w:end="227"/>
@@ -465,7 +395,7 @@
           <w:numId w:val="3"/>
         </w:numPr>
         <w:suppressAutoHyphens w:val="true"/>
-        <w:overflowPunct w:val="true"/>
+        <w:overflowPunct w:val="false"/>
         <w:bidi w:val="0"/>
         <w:spacing w:lineRule="auto" w:line="276" w:before="0" w:after="119"/>
         <w:ind w:hanging="283" w:start="567" w:end="227"/>
@@ -497,6 +427,167 @@
           <w:lang w:val="en-GB"/>
         </w:rPr>
         <w:t>Experience</w:t>
+        <w:br/>
+      </w:r>
+      <w:r>
+        <w:rPr>
+          <w:lang w:val="en-GB"/>
+        </w:rPr>
+        <w:t>Full Stack Contractor</w:t>
+      </w:r>
+    </w:p>
+    <w:p>
+      <w:pPr>
+        <w:pStyle w:val="Heading3"/>
+        <w:numPr>
+          <w:ilvl w:val="2"/>
+          <w:numId w:val="1"/>
+        </w:numPr>
+        <w:bidi w:val="0"/>
+        <w:ind w:hanging="0" w:start="0"/>
+        <w:jc w:val="start"/>
+        <w:rPr/>
+      </w:pPr>
+      <w:r>
+        <w:rPr>
+          <w:b/>
+          <w:bCs/>
+        </w:rPr>
+        <w:t>Trading under Orchid</w:t>
+      </w:r>
+      <w:r>
+        <w:rPr>
+          <w:b/>
+          <w:bCs/>
+        </w:rPr>
+        <w:t xml:space="preserve"> </w:t>
+      </w:r>
+      <w:r>
+        <w:rPr/>
+        <w:t>(</w:t>
+      </w:r>
+      <w:r>
+        <w:rPr/>
+        <w:t>Freelance and Contracts</w:t>
+      </w:r>
+      <w:r>
+        <w:rPr/>
+        <w:t>) — (Remote)</w:t>
+      </w:r>
+    </w:p>
+    <w:p>
+      <w:pPr>
+        <w:pStyle w:val="BodyText"/>
+        <w:numPr>
+          <w:ilvl w:val="0"/>
+          <w:numId w:val="1"/>
+        </w:numPr>
+        <w:bidi w:val="0"/>
+        <w:ind w:hanging="0" w:start="0"/>
+        <w:jc w:val="start"/>
+        <w:rPr>
+          <w:lang w:val="en-GB"/>
+        </w:rPr>
+      </w:pPr>
+      <w:r>
+        <w:rPr>
+          <w:i/>
+          <w:iCs/>
+          <w:shd w:fill="auto" w:val="clear"/>
+          <w:lang w:val="en-GB"/>
+        </w:rPr>
+        <w:t xml:space="preserve">Dec </w:t>
+      </w:r>
+      <w:r>
+        <w:rPr>
+          <w:i/>
+          <w:iCs/>
+          <w:shd w:fill="auto" w:val="clear"/>
+          <w:lang w:val="en-GB"/>
+        </w:rPr>
+        <w:t>2024</w:t>
+      </w:r>
+      <w:r>
+        <w:rPr>
+          <w:i/>
+          <w:iCs/>
+          <w:lang w:val="en-GB"/>
+        </w:rPr>
+        <w:t xml:space="preserve"> – </w:t>
+      </w:r>
+      <w:r>
+        <w:rPr>
+          <w:i/>
+          <w:iCs/>
+          <w:lang w:val="en-GB"/>
+        </w:rPr>
+        <w:t>Present</w:t>
+      </w:r>
+    </w:p>
+    <w:p>
+      <w:pPr>
+        <w:pStyle w:val="ListBullet"/>
+        <w:widowControl w:val="false"/>
+        <w:numPr>
+          <w:ilvl w:val="0"/>
+          <w:numId w:val="4"/>
+        </w:numPr>
+        <w:suppressAutoHyphens w:val="true"/>
+        <w:overflowPunct w:val="false"/>
+        <w:bidi w:val="0"/>
+        <w:spacing w:lineRule="auto" w:line="276" w:before="0" w:after="119"/>
+        <w:contextualSpacing/>
+        <w:jc w:val="start"/>
+        <w:rPr/>
+      </w:pPr>
+      <w:r>
+        <w:rPr>
+          <w:lang w:val="en-GB"/>
+        </w:rPr>
+        <w:t>Shopify development for an e-commerce store</w:t>
+      </w:r>
+      <w:r>
+        <w:rPr>
+          <w:lang w:val="en-GB"/>
+        </w:rPr>
+        <w:t>.</w:t>
+      </w:r>
+    </w:p>
+    <w:p>
+      <w:pPr>
+        <w:pStyle w:val="ListBullet"/>
+        <w:widowControl w:val="false"/>
+        <w:numPr>
+          <w:ilvl w:val="0"/>
+          <w:numId w:val="4"/>
+        </w:numPr>
+        <w:suppressAutoHyphens w:val="true"/>
+        <w:overflowPunct w:val="false"/>
+        <w:bidi w:val="0"/>
+        <w:spacing w:lineRule="auto" w:line="276" w:before="0" w:after="119"/>
+        <w:contextualSpacing/>
+        <w:jc w:val="start"/>
+        <w:rPr>
+          <w:i w:val="false"/>
+          <w:i w:val="false"/>
+          <w:iCs w:val="false"/>
+        </w:rPr>
+      </w:pPr>
+      <w:r>
+        <w:rPr>
+          <w:i w:val="false"/>
+          <w:iCs w:val="false"/>
+          <w:lang w:val="en-GB"/>
+        </w:rPr>
+        <w:t>L</w:t>
+      </w:r>
+      <w:r>
+        <w:rPr>
+          <w:i w:val="false"/>
+          <w:iCs w:val="false"/>
+          <w:lang w:val="en-GB"/>
+        </w:rPr>
+        <w:t>aravel development and DevOps for a Human Resources SaaS startup</w:t>
       </w:r>
     </w:p>
     <w:p>
@@ -513,15 +604,7 @@
       </w:pPr>
       <w:r>
         <w:rPr/>
-        <w:t xml:space="preserve">DevOps </w:t>
-      </w:r>
-      <w:r>
-        <w:rPr/>
-        <w:t xml:space="preserve">&amp; </w:t>
-      </w:r>
-      <w:r>
-        <w:rPr/>
-        <w:t>Technical Lead</w:t>
+        <w:t>DevOps &amp; Technical Lead</w:t>
       </w:r>
     </w:p>
     <w:p>
@@ -577,7 +660,14 @@
           <w:i/>
           <w:iCs/>
         </w:rPr>
-        <w:t xml:space="preserve"> – Present</w:t>
+        <w:t xml:space="preserve"> – </w:t>
+      </w:r>
+      <w:r>
+        <w:rPr>
+          <w:i/>
+          <w:iCs/>
+        </w:rPr>
+        <w:t>Dec 2024</w:t>
       </w:r>
     </w:p>
     <w:p>
@@ -589,7 +679,7 @@
           <w:numId w:val="3"/>
         </w:numPr>
         <w:suppressAutoHyphens w:val="true"/>
-        <w:overflowPunct w:val="true"/>
+        <w:overflowPunct w:val="false"/>
         <w:bidi w:val="0"/>
         <w:spacing w:lineRule="auto" w:line="276" w:before="0" w:after="119"/>
         <w:ind w:hanging="283" w:start="567" w:end="227"/>
@@ -613,7 +703,7 @@
           <w:numId w:val="3"/>
         </w:numPr>
         <w:suppressAutoHyphens w:val="true"/>
-        <w:overflowPunct w:val="true"/>
+        <w:overflowPunct w:val="false"/>
         <w:bidi w:val="0"/>
         <w:spacing w:lineRule="auto" w:line="276" w:before="0" w:after="119"/>
         <w:ind w:hanging="283" w:start="567" w:end="227"/>
@@ -637,7 +727,7 @@
           <w:numId w:val="3"/>
         </w:numPr>
         <w:suppressAutoHyphens w:val="true"/>
-        <w:overflowPunct w:val="true"/>
+        <w:overflowPunct w:val="false"/>
         <w:bidi w:val="0"/>
         <w:spacing w:lineRule="auto" w:line="276" w:before="0" w:after="119"/>
         <w:ind w:hanging="283" w:start="567" w:end="227"/>
@@ -661,7 +751,7 @@
           <w:numId w:val="3"/>
         </w:numPr>
         <w:suppressAutoHyphens w:val="true"/>
-        <w:overflowPunct w:val="true"/>
+        <w:overflowPunct w:val="false"/>
         <w:bidi w:val="0"/>
         <w:spacing w:lineRule="auto" w:line="276" w:before="0" w:after="119"/>
         <w:ind w:hanging="283" w:start="567" w:end="227"/>
@@ -767,7 +857,7 @@
           <w:numId w:val="3"/>
         </w:numPr>
         <w:suppressAutoHyphens w:val="true"/>
-        <w:overflowPunct w:val="true"/>
+        <w:overflowPunct w:val="false"/>
         <w:bidi w:val="0"/>
         <w:spacing w:lineRule="auto" w:line="276" w:before="0" w:after="119"/>
         <w:ind w:hanging="283" w:start="567" w:end="227"/>
@@ -789,7 +879,7 @@
           <w:numId w:val="3"/>
         </w:numPr>
         <w:suppressAutoHyphens w:val="true"/>
-        <w:overflowPunct w:val="true"/>
+        <w:overflowPunct w:val="false"/>
         <w:bidi w:val="0"/>
         <w:spacing w:lineRule="auto" w:line="276" w:before="0" w:after="119"/>
         <w:ind w:hanging="283" w:start="567" w:end="227"/>
@@ -811,7 +901,7 @@
           <w:numId w:val="3"/>
         </w:numPr>
         <w:suppressAutoHyphens w:val="true"/>
-        <w:overflowPunct w:val="true"/>
+        <w:overflowPunct w:val="false"/>
         <w:bidi w:val="0"/>
         <w:spacing w:lineRule="auto" w:line="276" w:before="0" w:after="119"/>
         <w:ind w:hanging="283" w:start="567" w:end="227"/>
@@ -833,7 +923,7 @@
           <w:numId w:val="3"/>
         </w:numPr>
         <w:suppressAutoHyphens w:val="true"/>
-        <w:overflowPunct w:val="true"/>
+        <w:overflowPunct w:val="false"/>
         <w:bidi w:val="0"/>
         <w:spacing w:lineRule="auto" w:line="276" w:before="0" w:after="119"/>
         <w:ind w:hanging="283" w:start="567" w:end="227"/>
@@ -1105,7 +1195,7 @@
           <w:numId w:val="3"/>
         </w:numPr>
         <w:suppressAutoHyphens w:val="true"/>
-        <w:overflowPunct w:val="true"/>
+        <w:overflowPunct w:val="false"/>
         <w:bidi w:val="0"/>
         <w:spacing w:lineRule="auto" w:line="276" w:before="0" w:after="119"/>
         <w:ind w:hanging="283" w:start="567" w:end="227"/>
@@ -1146,7 +1236,7 @@
           <w:numId w:val="3"/>
         </w:numPr>
         <w:suppressAutoHyphens w:val="true"/>
-        <w:overflowPunct w:val="true"/>
+        <w:overflowPunct w:val="false"/>
         <w:bidi w:val="0"/>
         <w:spacing w:lineRule="auto" w:line="276" w:before="0" w:after="119"/>
         <w:ind w:hanging="283" w:start="567" w:end="227"/>
@@ -1239,7 +1329,7 @@
       <w:rPr>
         <w:lang w:val="en-GB"/>
       </w:rPr>
-      <w:t>27/11/24</w:t>
+      <w:t>06/06/25</w:t>
     </w:r>
     <w:r>
       <w:rPr>
@@ -1317,7 +1407,7 @@
       <w:rPr>
         <w:lang w:val="en-GB"/>
       </w:rPr>
-      <w:t>2</w:t>
+      <w:t>3</w:t>
     </w:r>
     <w:r>
       <w:rPr>
@@ -1353,7 +1443,7 @@
       <w:rPr>
         <w:lang w:val="en-GB"/>
       </w:rPr>
-      <w:t>2</w:t>
+      <w:t>3</w:t>
     </w:r>
     <w:r>
       <w:rPr>
@@ -1476,7 +1566,7 @@
       <w:rPr>
         <w:lang w:val="en-GB"/>
       </w:rPr>
-      <w:t>2</w:t>
+      <w:t>3</w:t>
     </w:r>
     <w:r>
       <w:rPr>
@@ -1929,6 +2019,161 @@
     </w:lvl>
   </w:abstractNum>
   <w:abstractNum w:abstractNumId="4">
+    <w:lvl w:ilvl="0">
+      <w:start w:val="1"/>
+      <w:numFmt w:val="bullet"/>
+      <w:lvlText w:val=""/>
+      <w:lvlJc w:val="start"/>
+      <w:pPr>
+        <w:tabs>
+          <w:tab w:val="num" w:pos="720"/>
+        </w:tabs>
+        <w:ind w:start="720" w:hanging="360"/>
+      </w:pPr>
+      <w:rPr>
+        <w:rFonts w:ascii="Symbol" w:hAnsi="Symbol" w:cs="Symbol" w:hint="default"/>
+        <w:sz w:val="24"/>
+        <w:color w:val="073664"/>
+      </w:rPr>
+    </w:lvl>
+    <w:lvl w:ilvl="1">
+      <w:start w:val="1"/>
+      <w:numFmt w:val="bullet"/>
+      <w:lvlText w:val="◦"/>
+      <w:lvlJc w:val="start"/>
+      <w:pPr>
+        <w:tabs>
+          <w:tab w:val="num" w:pos="1080"/>
+        </w:tabs>
+        <w:ind w:start="1080" w:hanging="360"/>
+      </w:pPr>
+      <w:rPr>
+        <w:rFonts w:ascii="OpenSymbol" w:hAnsi="OpenSymbol" w:cs="OpenSymbol" w:hint="default"/>
+        <w:sz w:val="24"/>
+        <w:color w:val="073664"/>
+      </w:rPr>
+    </w:lvl>
+    <w:lvl w:ilvl="2">
+      <w:start w:val="1"/>
+      <w:numFmt w:val="bullet"/>
+      <w:lvlText w:val="▪"/>
+      <w:lvlJc w:val="start"/>
+      <w:pPr>
+        <w:tabs>
+          <w:tab w:val="num" w:pos="1440"/>
+        </w:tabs>
+        <w:ind w:start="1440" w:hanging="360"/>
+      </w:pPr>
+      <w:rPr>
+        <w:rFonts w:ascii="OpenSymbol" w:hAnsi="OpenSymbol" w:cs="OpenSymbol" w:hint="default"/>
+        <w:sz w:val="24"/>
+        <w:color w:val="073664"/>
+      </w:rPr>
+    </w:lvl>
+    <w:lvl w:ilvl="3">
+      <w:start w:val="1"/>
+      <w:numFmt w:val="bullet"/>
+      <w:lvlText w:val=""/>
+      <w:lvlJc w:val="start"/>
+      <w:pPr>
+        <w:tabs>
+          <w:tab w:val="num" w:pos="1800"/>
+        </w:tabs>
+        <w:ind w:start="1800" w:hanging="360"/>
+      </w:pPr>
+      <w:rPr>
+        <w:rFonts w:ascii="Symbol" w:hAnsi="Symbol" w:cs="Symbol" w:hint="default"/>
+        <w:sz w:val="24"/>
+        <w:color w:val="073664"/>
+      </w:rPr>
+    </w:lvl>
+    <w:lvl w:ilvl="4">
+      <w:start w:val="1"/>
+      <w:numFmt w:val="bullet"/>
+      <w:lvlText w:val="◦"/>
+      <w:lvlJc w:val="start"/>
+      <w:pPr>
+        <w:tabs>
+          <w:tab w:val="num" w:pos="2160"/>
+        </w:tabs>
+        <w:ind w:start="2160" w:hanging="360"/>
+      </w:pPr>
+      <w:rPr>
+        <w:rFonts w:ascii="OpenSymbol" w:hAnsi="OpenSymbol" w:cs="OpenSymbol" w:hint="default"/>
+        <w:sz w:val="24"/>
+        <w:color w:val="073664"/>
+      </w:rPr>
+    </w:lvl>
+    <w:lvl w:ilvl="5">
+      <w:start w:val="1"/>
+      <w:numFmt w:val="bullet"/>
+      <w:lvlText w:val="▪"/>
+      <w:lvlJc w:val="start"/>
+      <w:pPr>
+        <w:tabs>
+          <w:tab w:val="num" w:pos="2520"/>
+        </w:tabs>
+        <w:ind w:start="2520" w:hanging="360"/>
+      </w:pPr>
+      <w:rPr>
+        <w:rFonts w:ascii="OpenSymbol" w:hAnsi="OpenSymbol" w:cs="OpenSymbol" w:hint="default"/>
+        <w:sz w:val="24"/>
+        <w:color w:val="073664"/>
+      </w:rPr>
+    </w:lvl>
+    <w:lvl w:ilvl="6">
+      <w:start w:val="1"/>
+      <w:numFmt w:val="bullet"/>
+      <w:lvlText w:val=""/>
+      <w:lvlJc w:val="start"/>
+      <w:pPr>
+        <w:tabs>
+          <w:tab w:val="num" w:pos="2880"/>
+        </w:tabs>
+        <w:ind w:start="2880" w:hanging="360"/>
+      </w:pPr>
+      <w:rPr>
+        <w:rFonts w:ascii="Symbol" w:hAnsi="Symbol" w:cs="Symbol" w:hint="default"/>
+        <w:sz w:val="24"/>
+        <w:color w:val="073664"/>
+      </w:rPr>
+    </w:lvl>
+    <w:lvl w:ilvl="7">
+      <w:start w:val="1"/>
+      <w:numFmt w:val="bullet"/>
+      <w:lvlText w:val="◦"/>
+      <w:lvlJc w:val="start"/>
+      <w:pPr>
+        <w:tabs>
+          <w:tab w:val="num" w:pos="3240"/>
+        </w:tabs>
+        <w:ind w:start="3240" w:hanging="360"/>
+      </w:pPr>
+      <w:rPr>
+        <w:rFonts w:ascii="OpenSymbol" w:hAnsi="OpenSymbol" w:cs="OpenSymbol" w:hint="default"/>
+        <w:sz w:val="24"/>
+        <w:color w:val="073664"/>
+      </w:rPr>
+    </w:lvl>
+    <w:lvl w:ilvl="8">
+      <w:start w:val="1"/>
+      <w:numFmt w:val="bullet"/>
+      <w:lvlText w:val="▪"/>
+      <w:lvlJc w:val="start"/>
+      <w:pPr>
+        <w:tabs>
+          <w:tab w:val="num" w:pos="3600"/>
+        </w:tabs>
+        <w:ind w:start="3600" w:hanging="360"/>
+      </w:pPr>
+      <w:rPr>
+        <w:rFonts w:ascii="OpenSymbol" w:hAnsi="OpenSymbol" w:cs="OpenSymbol" w:hint="default"/>
+        <w:sz w:val="24"/>
+        <w:color w:val="073664"/>
+      </w:rPr>
+    </w:lvl>
+  </w:abstractNum>
+  <w:abstractNum w:abstractNumId="5">
     <w:lvl w:ilvl="0">
       <w:start w:val="1"/>
       <w:numFmt w:val="none"/>
@@ -2059,6 +2304,9 @@
   <w:num w:numId="4">
     <w:abstractNumId w:val="4"/>
   </w:num>
+  <w:num w:numId="5">
+    <w:abstractNumId w:val="5"/>
+  </w:num>
 </w:numbering>
 </file>
 
@@ -2085,7 +2333,7 @@
     <w:pPr>
       <w:widowControl w:val="false"/>
       <w:suppressAutoHyphens w:val="true"/>
-      <w:overflowPunct w:val="true"/>
+      <w:overflowPunct w:val="false"/>
       <w:bidi w:val="0"/>
       <w:spacing w:before="0" w:after="0"/>
       <w:jc w:val="start"/>
@@ -2100,7 +2348,7 @@
     </w:rPr>
   </w:style>
   <w:style w:type="paragraph" w:styleId="Heading1">
-    <w:name w:val="Heading 1"/>
+    <w:name w:val="heading 1"/>
     <w:basedOn w:val="Heading"/>
     <w:next w:val="BodyText"/>
     <w:qFormat/>
@@ -2122,7 +2370,7 @@
     </w:rPr>
   </w:style>
   <w:style w:type="paragraph" w:styleId="Heading2">
-    <w:name w:val="Heading 2"/>
+    <w:name w:val="heading 2"/>
     <w:basedOn w:val="Heading1"/>
     <w:next w:val="BodyText"/>
     <w:qFormat/>
@@ -2152,7 +2400,7 @@
     </w:rPr>
   </w:style>
   <w:style w:type="paragraph" w:styleId="Heading3">
-    <w:name w:val="Heading 3"/>
+    <w:name w:val="heading 3"/>
     <w:basedOn w:val="Heading1"/>
     <w:next w:val="BodyText"/>
     <w:qFormat/>
@@ -2174,7 +2422,7 @@
     </w:rPr>
   </w:style>
   <w:style w:type="paragraph" w:styleId="Heading4">
-    <w:name w:val="Heading 4"/>
+    <w:name w:val="heading 4"/>
     <w:basedOn w:val="Heading1"/>
     <w:next w:val="BodyText"/>
     <w:qFormat/>
@@ -2199,7 +2447,7 @@
     </w:rPr>
   </w:style>
   <w:style w:type="paragraph" w:styleId="Heading5">
-    <w:name w:val="Heading 5"/>
+    <w:name w:val="heading 5"/>
     <w:basedOn w:val="Heading1"/>
     <w:next w:val="BodyText"/>
     <w:qFormat/>
@@ -2222,7 +2470,7 @@
     </w:rPr>
   </w:style>
   <w:style w:type="paragraph" w:styleId="Heading6">
-    <w:name w:val="Heading 6"/>
+    <w:name w:val="heading 6"/>
     <w:basedOn w:val="Heading1"/>
     <w:next w:val="BodyText"/>
     <w:qFormat/>
@@ -2241,7 +2489,7 @@
     </w:rPr>
   </w:style>
   <w:style w:type="paragraph" w:styleId="Heading7">
-    <w:name w:val="Heading 7"/>
+    <w:name w:val="heading 7"/>
     <w:basedOn w:val="Heading1"/>
     <w:next w:val="BodyText"/>
     <w:qFormat/>
@@ -2260,7 +2508,7 @@
     </w:rPr>
   </w:style>
   <w:style w:type="paragraph" w:styleId="Heading8">
-    <w:name w:val="Heading 8"/>
+    <w:name w:val="heading 8"/>
     <w:basedOn w:val="Heading1"/>
     <w:next w:val="BodyText"/>
     <w:qFormat/>
@@ -2279,7 +2527,7 @@
     </w:rPr>
   </w:style>
   <w:style w:type="paragraph" w:styleId="Heading9">
-    <w:name w:val="Heading 9"/>
+    <w:name w:val="heading 9"/>
     <w:basedOn w:val="Heading1"/>
     <w:next w:val="BodyText"/>
     <w:qFormat/>
@@ -2312,10 +2560,12 @@
     <w:qFormat/>
     <w:rPr>
       <w:rFonts w:ascii="Linux Biolinum G" w:hAnsi="Linux Biolinum G"/>
+      <w:sz w:val="22"/>
+      <w:vertAlign w:val="superscript"/>
     </w:rPr>
   </w:style>
   <w:style w:type="character" w:styleId="PageNumber">
-    <w:name w:val="Page Number"/>
+    <w:name w:val="page number"/>
     <w:rPr>
       <w:rFonts w:ascii="Linux Biolinum G" w:hAnsi="Linux Biolinum G"/>
     </w:rPr>
@@ -2369,10 +2619,11 @@
     <w:rPr>
       <w:rFonts w:ascii="Linux Biolinum G" w:hAnsi="Linux Biolinum G"/>
       <w:sz w:val="22"/>
+      <w:vertAlign w:val="superscript"/>
     </w:rPr>
   </w:style>
   <w:style w:type="character" w:styleId="LineNumber">
-    <w:name w:val="Line Number"/>
+    <w:name w:val="line number"/>
     <w:rPr>
       <w:rFonts w:ascii="Linux Biolinum G" w:hAnsi="Linux Biolinum G"/>
       <w:sz w:val="24"/>
@@ -2425,7 +2676,7 @@
     </w:rPr>
   </w:style>
   <w:style w:type="character" w:styleId="FootnoteReference">
-    <w:name w:val="Footnote Reference"/>
+    <w:name w:val="footnote reference"/>
     <w:rPr>
       <w:rFonts w:ascii="Linux Biolinum G" w:hAnsi="Linux Biolinum G"/>
       <w:sz w:val="22"/>
@@ -2508,7 +2759,7 @@
     </w:rPr>
   </w:style>
   <w:style w:type="character" w:styleId="EndnoteReference">
-    <w:name w:val="Endnote Reference"/>
+    <w:name w:val="endnote reference"/>
     <w:rPr>
       <w:rFonts w:ascii="Linux Biolinum G" w:hAnsi="Linux Biolinum G"/>
       <w:sz w:val="22"/>
@@ -2599,7 +2850,7 @@
     <w:rPr/>
   </w:style>
   <w:style w:type="paragraph" w:styleId="Caption">
-    <w:name w:val="Caption"/>
+    <w:name w:val="caption"/>
     <w:basedOn w:val="Normal"/>
     <w:qFormat/>
     <w:pPr>
@@ -2639,7 +2890,7 @@
     </w:rPr>
   </w:style>
   <w:style w:type="paragraph" w:styleId="IndexHeading">
-    <w:name w:val="Index Heading"/>
+    <w:name w:val="index heading"/>
     <w:basedOn w:val="Heading"/>
     <w:pPr>
       <w:suppressLineNumbers/>
@@ -2747,7 +2998,7 @@
     </w:rPr>
   </w:style>
   <w:style w:type="paragraph" w:styleId="EnvelopeAddress">
-    <w:name w:val="Envelope Address"/>
+    <w:name w:val="envelope address"/>
     <w:basedOn w:val="Normal"/>
     <w:pPr>
       <w:suppressLineNumbers/>
@@ -2756,7 +3007,7 @@
     <w:rPr/>
   </w:style>
   <w:style w:type="paragraph" w:styleId="TableofAuthorities">
-    <w:name w:val="Table of Authorities"/>
+    <w:name w:val="table of authorities"/>
     <w:basedOn w:val="Heading"/>
     <w:pPr>
       <w:suppressLineNumbers/>
@@ -2826,7 +3077,7 @@
     <w:rPr/>
   </w:style>
   <w:style w:type="paragraph" w:styleId="EnvelopeReturn">
-    <w:name w:val="Envelope Return"/>
+    <w:name w:val="envelope return"/>
     <w:basedOn w:val="Normal"/>
     <w:next w:val="Subtitle"/>
     <w:pPr>
@@ -2907,7 +3158,7 @@
         <w:tab w:val="right" w:pos="10432" w:leader="none"/>
       </w:tabs>
       <w:suppressAutoHyphens w:val="true"/>
-      <w:overflowPunct w:val="true"/>
+      <w:overflowPunct w:val="false"/>
       <w:bidi w:val="0"/>
       <w:spacing w:lineRule="auto" w:line="276" w:before="0" w:after="119"/>
       <w:ind w:hanging="283" w:start="567" w:end="227"/>
@@ -2931,7 +3182,7 @@
     <w:rPr/>
   </w:style>
   <w:style w:type="paragraph" w:styleId="Footer">
-    <w:name w:val="Footer"/>
+    <w:name w:val="footer"/>
     <w:basedOn w:val="HeaderandFooter"/>
     <w:pPr>
       <w:suppressLineNumbers/>
@@ -2961,7 +3212,7 @@
     <w:rPr/>
   </w:style>
   <w:style w:type="paragraph" w:styleId="Header">
-    <w:name w:val="Header"/>
+    <w:name w:val="header"/>
     <w:basedOn w:val="HeaderandFooter"/>
     <w:next w:val="Subtitle"/>
     <w:pPr>

</xml_diff>